<commit_message>
Add funding, incentives and survey-administration details
Co-Authored-By: Claude Opus 5.5 <noreply@anthropic.com>
Claude-Session: https://claude.ai/code/session_01HkfqEmJsfG521CNZGXo2WH
</commit_message>
<xml_diff>
--- a/manuscript/build/additional_file_3_CHERRIES_checklist.docx
+++ b/manuscript/build/additional_file_3_CHERRIES_checklist.docx
@@ -640,7 +640,7 @@
               <w:rPr>
                 <w:sz w:val="18"/>
               </w:rPr>
-              <w:t xml:space="preserve">[Authors to confirm: none]</w:t>
+              <w:t xml:space="preserve">None</w:t>
             </w:r>
           </w:p>
         </w:tc>
@@ -891,7 +891,7 @@
               <w:rPr>
                 <w:sz w:val="18"/>
               </w:rPr>
-              <w:t xml:space="preserve">[Authors to confirm]</w:t>
+              <w:t xml:space="preserve">One page</w:t>
             </w:r>
           </w:p>
         </w:tc>
@@ -977,7 +977,7 @@
               <w:rPr>
                 <w:sz w:val="18"/>
               </w:rPr>
-              <w:t xml:space="preserve">[Authors to confirm whether respondents could go back and change answers]</w:t>
+              <w:t xml:space="preserve">Yes; respondents could review and change answers before submitting</w:t>
             </w:r>
           </w:p>
         </w:tc>

</xml_diff>

<commit_message>
Describe screening accurately for the single-page form
Co-Authored-By: Claude Opus 5.5 <noreply@anthropic.com>
Claude-Session: https://claude.ai/code/session_01HkfqEmJsfG521CNZGXo2WH
</commit_message>
<xml_diff>
--- a/manuscript/build/additional_file_3_CHERRIES_checklist.docx
+++ b/manuscript/build/additional_file_3_CHERRIES_checklist.docx
@@ -226,7 +226,7 @@
               <w:rPr>
                 <w:sz w:val="18"/>
               </w:rPr>
-              <w:t xml:space="preserve">First page of the form presented study information and a consent statement before any question</w:t>
+              <w:t xml:space="preserve">The form opened with study information and a consent statement, before any question</w:t>
             </w:r>
           </w:p>
         </w:tc>
@@ -769,7 +769,7 @@
               <w:rPr>
                 <w:sz w:val="18"/>
               </w:rPr>
-              <w:t xml:space="preserve">Yes, from 20 July 2025: respondents answering</w:t>
+              <w:t xml:space="preserve">No. From 20 July 2025 an eligibility question opened the form; the 23 respondents answering</w:t>
             </w:r>
             <w:r>
               <w:rPr>
@@ -805,7 +805,7 @@
               <w:rPr>
                 <w:sz w:val="18"/>
               </w:rPr>
-              <w:t xml:space="preserve">to the eligibility question were routed out</w:t>
+              <w:t xml:space="preserve">submitted without answering the items</w:t>
             </w:r>
           </w:p>
         </w:tc>
@@ -1158,7 +1158,43 @@
               <w:rPr>
                 <w:sz w:val="18"/>
               </w:rPr>
-              <w:t xml:space="preserve">416 of 439 submissions completed the questionnaire (the remaining 23 were routed out at eligibility)</w:t>
+              <w:t xml:space="preserve">416 of 439 submissions completed the questionnaire (the remaining 23 answered</w:t>
+            </w:r>
+            <w:r>
+              <w:rPr>
+                <w:sz w:val="18"/>
+              </w:rPr>
+              <w:t xml:space="preserve"> </w:t>
+            </w:r>
+            <w:r>
+              <w:rPr>
+                <w:sz w:val="18"/>
+              </w:rPr>
+              <w:t xml:space="preserve">“</w:t>
+            </w:r>
+            <w:r>
+              <w:rPr>
+                <w:sz w:val="18"/>
+              </w:rPr>
+              <w:t xml:space="preserve">No</w:t>
+            </w:r>
+            <w:r>
+              <w:rPr>
+                <w:sz w:val="18"/>
+              </w:rPr>
+              <w:t xml:space="preserve">”</w:t>
+            </w:r>
+            <w:r>
+              <w:rPr>
+                <w:sz w:val="18"/>
+              </w:rPr>
+              <w:t xml:space="preserve"> </w:t>
+            </w:r>
+            <w:r>
+              <w:rPr>
+                <w:sz w:val="18"/>
+              </w:rPr>
+              <w:t xml:space="preserve">to the eligibility question and left the items blank)</w:t>
             </w:r>
           </w:p>
         </w:tc>

</xml_diff>

<commit_message>
Restore routed-out screening description; align ethics statement with REC certificate
Co-Authored-By: Claude Opus 5.5 <noreply@anthropic.com>
Claude-Session: https://claude.ai/code/session_01HkfqEmJsfG521CNZGXo2WH
</commit_message>
<xml_diff>
--- a/manuscript/build/additional_file_3_CHERRIES_checklist.docx
+++ b/manuscript/build/additional_file_3_CHERRIES_checklist.docx
@@ -769,7 +769,7 @@
               <w:rPr>
                 <w:sz w:val="18"/>
               </w:rPr>
-              <w:t xml:space="preserve">No. From 20 July 2025 an eligibility question opened the form; the 23 respondents answering</w:t>
+              <w:t xml:space="preserve">Yes. From 20 July 2025 an eligibility question opened the form; respondents answering</w:t>
             </w:r>
             <w:r>
               <w:rPr>
@@ -805,7 +805,7 @@
               <w:rPr>
                 <w:sz w:val="18"/>
               </w:rPr>
-              <w:t xml:space="preserve">submitted without answering the items</w:t>
+              <w:t xml:space="preserve">(n = 23) were routed out before the questionnaire</w:t>
             </w:r>
           </w:p>
         </w:tc>
@@ -891,7 +891,7 @@
               <w:rPr>
                 <w:sz w:val="18"/>
               </w:rPr>
-              <w:t xml:space="preserve">One page</w:t>
+              <w:t xml:space="preserve">All questionnaire items on one page (preceded, from 20 July 2025, by the eligibility question)</w:t>
             </w:r>
           </w:p>
         </w:tc>
@@ -1194,7 +1194,7 @@
               <w:rPr>
                 <w:sz w:val="18"/>
               </w:rPr>
-              <w:t xml:space="preserve">to the eligibility question and left the items blank)</w:t>
+              <w:t xml:space="preserve">to the eligibility question and were routed out)</w:t>
             </w:r>
           </w:p>
         </w:tc>

</xml_diff>